<commit_message>
Replace report Section 7 with the student's AI use and reflection draft
</commit_message>
<xml_diff>
--- a/report/MMA3001_Project_Report_Harvey.docx
+++ b/report/MMA3001_Project_Report_Harvey.docx
@@ -4552,7 +4552,7 @@
         <w:t xml:space="preserve"> </w:t>
       </w:r>
       <w:r>
-        <w:t xml:space="preserve">Claude (Anthropic, Claude Opus 5.5) through claude.ai, 24-25 October 2026.</w:t>
+        <w:t xml:space="preserve">Claude (Anthropic, Claude Opus 5.5).</w:t>
       </w:r>
     </w:p>
     <w:p>
@@ -4653,7 +4653,7 @@
               <w:jc w:val="left"/>
             </w:pPr>
             <w:r>
-              <w:t xml:space="preserve">Chose Dataset 2 after asking how it knew the sensors were broken, and checked the raw data myself</w:t>
+              <w:t xml:space="preserve">Questioned how it knew the sensors were broken, checked the raw data myself, then chose Dataset 2</w:t>
             </w:r>
           </w:p>
         </w:tc>
@@ -4793,19 +4793,19 @@
               <w:jc w:val="left"/>
             </w:pPr>
             <w:r>
-              <w:t xml:space="preserve">High (first draft)</w:t>
-            </w:r>
-          </w:p>
-        </w:tc>
-        <w:tc>
-          <w:tcPr/>
-          <w:p>
-            <w:pPr>
-              <w:pStyle w:val="Compact"/>
-              <w:jc w:val="left"/>
-            </w:pPr>
-            <w:r>
-              <w:t xml:space="preserve">Rewrote it and checked the numbers against</w:t>
+              <w:t xml:space="preserve">High (drafting)</w:t>
+            </w:r>
+          </w:p>
+        </w:tc>
+        <w:tc>
+          <w:tcPr/>
+          <w:p>
+            <w:pPr>
+              <w:pStyle w:val="Compact"/>
+              <w:jc w:val="left"/>
+            </w:pPr>
+            <w:r>
+              <w:t xml:space="preserve">Directed the structure, tone and length, checked the numbers against</w:t>
             </w:r>
             <w:r>
               <w:t xml:space="preserve"> </w:t>
@@ -4816,6 +4816,9 @@
               </w:rPr>
               <w:t xml:space="preserve">results/</w:t>
             </w:r>
+            <w:r>
+              <w:t xml:space="preserve">, and wrote this section</w:t>
+            </w:r>
           </w:p>
         </w:tc>
       </w:tr>
@@ -4835,7 +4838,7 @@
         <w:t xml:space="preserve"> </w:t>
       </w:r>
       <w:r>
-        <w:t xml:space="preserve">I had about two days. Using AI for the code let me spend the time understanding and checking the methods. I had it explain each step before building it, which is also how I prepared for the interview.</w:t>
+        <w:t xml:space="preserve">I had about two days, so I used AI for the coding and drafting and spent my time understanding and checking the methods.</w:t>
       </w:r>
     </w:p>
     <w:p>
@@ -4853,7 +4856,7 @@
         <w:t xml:space="preserve"> </w:t>
       </w:r>
       <w:r>
-        <w:t xml:space="preserve">Tests with known answers (the 0.5-person example, the exact ODE solution, manufactured data), the conservation check, looking at raw data and every figure, and comparing claims with the source files.</w:t>
+        <w:t xml:space="preserve">Tests with known answers (the 0.5-person example, the exact ODE solution, manufactured data), looking at raw data and every figure, and comparing claims with the source and git files.</w:t>
       </w:r>
     </w:p>
     <w:p>
@@ -4931,18 +4934,6 @@
         <w:pStyle w:val="Compact"/>
       </w:pPr>
       <w:r>
-        <w:t xml:space="preserve">While splitting the git history into real, smaller commits (it refused to fake dates), it accidentally committed 64 MB of data, which we removed before uploading.</w:t>
-      </w:r>
-    </w:p>
-    <w:p>
-      <w:pPr>
-        <w:numPr>
-          <w:ilvl w:val="0"/>
-          <w:numId w:val="1004"/>
-        </w:numPr>
-        <w:pStyle w:val="Compact"/>
-      </w:pPr>
-      <w:r>
         <w:t xml:space="preserve">It used a database tool (DuckDB) that isn’t taught in the unit. In my scope review it was replaced with pandas, with identical results, and a number it had quoted from early exploration was corrected (0.53 to 0.50).</w:t>
       </w:r>
     </w:p>
@@ -4961,7 +4952,7 @@
         <w:t xml:space="preserve"> </w:t>
       </w:r>
       <w:r>
-        <w:t xml:space="preserve">The dataset, the forecast horizon, the scope, accepting the outage rule after testing it, the model choice by tie-break, asking for the scope reviews, and what to claim in this report.</w:t>
+        <w:t xml:space="preserve">The dataset, the forecast horizon and scope, keeping everything within the unit, the model choice, and what to claim in the report.</w:t>
       </w:r>
     </w:p>
     <w:p>

</xml_diff>

<commit_message>
Remove the 'Why I used it' paragraph from Section 7
</commit_message>
<xml_diff>
--- a/report/MMA3001_Project_Report_Harvey.docx
+++ b/report/MMA3001_Project_Report_Harvey.docx
@@ -4823,24 +4823,6 @@
         </w:tc>
       </w:tr>
     </w:tbl>
-    <w:p>
-      <w:pPr>
-        <w:pStyle w:val="BodyText"/>
-      </w:pPr>
-      <w:r>
-        <w:rPr>
-          <w:bCs/>
-          <w:b/>
-        </w:rPr>
-        <w:t xml:space="preserve">Why I used it.</w:t>
-      </w:r>
-      <w:r>
-        <w:t xml:space="preserve"> </w:t>
-      </w:r>
-      <w:r>
-        <w:t xml:space="preserve">I had about two days, so I used AI for the coding and drafting and spent my time understanding and checking the methods.</w:t>
-      </w:r>
-    </w:p>
     <w:p>
       <w:pPr>
         <w:pStyle w:val="BodyText"/>

</xml_diff>

<commit_message>
Update Section 7 contribution ratings
</commit_message>
<xml_diff>
--- a/report/MMA3001_Project_Report_Harvey.docx
+++ b/report/MMA3001_Project_Report_Harvey.docx
@@ -4641,7 +4641,7 @@
               <w:jc w:val="left"/>
             </w:pPr>
             <w:r>
-              <w:t xml:space="preserve">High</w:t>
+              <w:t xml:space="preserve">Medium</w:t>
             </w:r>
           </w:p>
         </w:tc>
@@ -4717,7 +4717,7 @@
               <w:jc w:val="left"/>
             </w:pPr>
             <w:r>
-              <w:t xml:space="preserve">Medium</w:t>
+              <w:t xml:space="preserve">Low</w:t>
             </w:r>
           </w:p>
         </w:tc>

</xml_diff>

<commit_message>
Update report row in Section 7 contribution table
</commit_message>
<xml_diff>
--- a/report/MMA3001_Project_Report_Harvey.docx
+++ b/report/MMA3001_Project_Report_Harvey.docx
@@ -4805,19 +4805,7 @@
               <w:jc w:val="left"/>
             </w:pPr>
             <w:r>
-              <w:t xml:space="preserve">Directed the structure, tone and length, checked the numbers against</w:t>
-            </w:r>
-            <w:r>
-              <w:t xml:space="preserve"> </w:t>
-            </w:r>
-            <w:r>
-              <w:rPr>
-                <w:rStyle w:val="VerbatimChar"/>
-              </w:rPr>
-              <w:t xml:space="preserve">results/</w:t>
-            </w:r>
-            <w:r>
-              <w:t xml:space="preserve">, and wrote this section</w:t>
+              <w:t xml:space="preserve">Directed the structure, tone and length, and reworded the first draft</w:t>
             </w:r>
           </w:p>
         </w:tc>

</xml_diff>

<commit_message>
Add 'Why I used it' paragraph to Section 7
</commit_message>
<xml_diff>
--- a/report/MMA3001_Project_Report_Harvey.docx
+++ b/report/MMA3001_Project_Report_Harvey.docx
@@ -4811,6 +4811,24 @@
         </w:tc>
       </w:tr>
     </w:tbl>
+    <w:p>
+      <w:pPr>
+        <w:pStyle w:val="BodyText"/>
+      </w:pPr>
+      <w:r>
+        <w:rPr>
+          <w:bCs/>
+          <w:b/>
+        </w:rPr>
+        <w:t xml:space="preserve">Why I used it.</w:t>
+      </w:r>
+      <w:r>
+        <w:t xml:space="preserve"> </w:t>
+      </w:r>
+      <w:r>
+        <w:t xml:space="preserve">I mainly wanted help with the coding and testing, which is where I used it most. Analysing a dataset of more than 9 million rows and building and testing several models by myself would have taken a very long time. Using AI for that let me spend more of my time analysing the results and making the report better.</w:t>
+      </w:r>
+    </w:p>
     <w:p>
       <w:pPr>
         <w:pStyle w:val="BodyText"/>

</xml_diff>

<commit_message>
Correct eight details in the report found in the final check against the data
11 April (Melbourne time) for the resampling example; 29,043 discarded messages; sensor 326 'often'; 12 h limit drops 1,470 hours (~4,000 rows); CO2 background sensitivity ranges; 0.24 us per step from timeit; lfilter speed-up range by size; G.38 matching wording.
</commit_message>
<xml_diff>
--- a/report/MMA3001_Project_Report_Harvey.docx
+++ b/report/MMA3001_Project_Report_Harvey.docx
@@ -777,7 +777,7 @@
         <w:t xml:space="preserve"> </w:t>
       </w:r>
       <w:r>
-        <w:t xml:space="preserve">The code checks its inputs and stops with a clear error message if something is wrong. This covers missing columns, wrong data types, timestamps without a time zone, negative headcounts, events in the wrong order, a time step of zero or less, broken JSON, and missing files. Smaller problems are handled without stopping. If one reading inside a JSON message has failed (sensor 326 sometimes sends an error code instead of a value), only that reading is skipped. Outage time is treated as missing, and any hour that is less than half covered by trusted data is dropped. A room the model hasn’t seen before still gets a forecast, based only on the time and its past headcounts. The inputs and outputs of every function are described in its docstring and in the HTML documentation generated with pdoc.</w:t>
+        <w:t xml:space="preserve">The code checks its inputs and stops with a clear error message if something is wrong. This covers missing columns, wrong data types, timestamps without a time zone, negative headcounts, events in the wrong order, a time step of zero or less, broken JSON, and missing files. Smaller problems are handled without stopping. If one reading inside a JSON message has failed (sensor 326 often sends an error code instead of a value), only that reading is skipped. Outage time is treated as missing, and any hour that is less than half covered by trusted data is dropped. A room the model hasn’t seen before still gets a forecast, based only on the time and its past headcounts. The inputs and outputs of every function are described in its docstring and in the HTML documentation generated with pdoc.</w:t>
       </w:r>
     </w:p>
     <w:bookmarkEnd w:id="21"/>
@@ -1067,7 +1067,7 @@
         <w:pStyle w:val="FirstParagraph"/>
       </w:pPr>
       <w:r>
-        <w:t xml:space="preserve">Because the function is made of flat steps, this sum gives the exact integral. The simpler option, averaging the rows in each hour, gives the wrong answer. Busy periods produce lots of rows because the count keeps changing, while quiet periods produce very few, so busy moments get counted too many times. In a typical hour the row average was 1.4 to 2.1 times too high, and in one hour in ten it was more than 12 times too high. For example, at 9am on 10 April 2024 in G.20, averaging the rows gives 3.6 people, while the true time-weighted average is 0.3. This step produced 84,422 hourly values.</w:t>
+        <w:t xml:space="preserve">Because the function is made of flat steps, this sum gives the exact integral. The simpler option, averaging the rows in each hour, gives the wrong answer. Busy periods produce lots of rows because the count keeps changing, while quiet periods produce very few, so busy moments get counted too many times. In a typical hour the row average was 1.4 to 2.1 times too high, and in one hour in ten it was more than 12 times too high. For example, at 9am on 11 April 2024 in G.20, averaging the rows gives 3.6 people, while the true time-weighted average is 0.3. This step produced 84,422 hourly values.</w:t>
       </w:r>
     </w:p>
     <w:bookmarkEnd w:id="25"/>
@@ -1488,7 +1488,7 @@
         <w:pStyle w:val="BodyText"/>
       </w:pPr>
       <w:r>
-        <w:t xml:space="preserve">One problem is that no CO₂ sensor is in the same room as an occupancy sensor, so I had to use another room’s headcount as a stand-in. I compared all five rooms against the CO₂ after removing the usual weekly pattern from both. Space 3e5a matched best (correlation 0.61), but it has no data from March or April, when the model was fitted. The next best was space 941f (0.50), so I used that. This is the weakest assumption in the project, and I return to it in Section 4.</w:t>
+        <w:t xml:space="preserve">One problem is that none of the occupancy spaces could be matched to room G.38, so I had to use another room’s headcount as a stand-in. I compared all five rooms against the CO₂ after removing the usual weekly pattern from both. Space 3e5a matched best (correlation 0.61), but it has no data from March or April, when the model was fitted. The next best was space 941f (0.50), so I used that. This is the weakest assumption in the project, and I return to it in Section 4.</w:t>
       </w:r>
     </w:p>
     <w:bookmarkEnd w:id="28"/>
@@ -3850,7 +3850,7 @@
         <w:pStyle w:val="BodyText"/>
       </w:pPr>
       <w:r>
-        <w:t xml:space="preserve">Person-hours is the total number of people multiplied by hours across all rooms. Each setting slightly changes which hours are included, but the limit for occupied rooms makes almost no difference, so the results don’t depend on that choice. Making the empty-room limit stricter (12 hours) throws away about 4,000 genuinely quiet weekend hours, so I kept 24 hours. For the CO₂ model, I varied the background level between 422 and 445 ppm. This changed g by about 4% but the daytime λ by about 13%, so λ is the most sensitive parameter in the physics model.</w:t>
+        <w:t xml:space="preserve">Person-hours is the total number of people multiplied by hours across all rooms. Each setting slightly changes which hours are included, but the limit for occupied rooms makes almost no difference, so the results don’t depend on that choice. Making the empty-room limit stricter (12 hours) drops 1,470 hours that were almost all empty (60% at weekends), which removes about 4,000 usable rows, so I kept 24 hours. For the CO₂ model, I varied the background level between 422 and 445 ppm. This changed g by at most 7%, but the daytime λ by 10 to 16%, so λ is the most sensitive parameter in the physics model.</w:t>
       </w:r>
     </w:p>
     <w:bookmarkEnd w:id="44"/>
@@ -4272,7 +4272,7 @@
         <w:t xml:space="preserve"> </w:t>
       </w:r>
       <w:r>
-        <w:t xml:space="preserve">The backward Euler solver does very little arithmetic for the amount of data it moves, so on the roofline (Figure 6) it sits in the memory-limited region. However, the original Python loop only reached 0.4% of that limit. Using line_profiler, I found that all of the time was spent inside the loop itself, about 0.7 microseconds per step, so the bottleneck was Python’s overhead rather than the hardware. Backward Euler for this equation is simply</w:t>
+        <w:t xml:space="preserve">The backward Euler solver does very little arithmetic for the amount of data it moves, so on the roofline (Figure 6) it sits in the memory-limited region. However, the original Python loop only reached 0.4% of that limit. Using line_profiler, I found that all of the time was spent inside the loop itself, about 0.24 microseconds per step, so the bottleneck was Python’s overhead rather than the hardware. Backward Euler for this equation is simply</w:t>
       </w:r>
       <w:r>
         <w:t xml:space="preserve"> </w:t>
@@ -4315,7 +4315,10 @@
         <w:t xml:space="preserve">35 to 38 times faster</w:t>
       </w:r>
       <w:r>
-        <w:t xml:space="preserve">, while still scaling linearly with the number of steps. It still only reaches 15% of the bandwidth limit, because each step has to wait for the one before it, so the real limit is how quickly one step can follow another rather than memory. On this 15-week dataset the loop only takes milliseconds either way, so the speed-up matters most if the model is fitted many times or scaled up to many sensors over several years. The neural network does much more arithmetic per byte (8.2), which puts it in the compute-limited region, but its small layers mean it only reaches 2.9% of peak.</w:t>
+        <w:t xml:space="preserve"> </w:t>
+      </w:r>
+      <w:r>
+        <w:t xml:space="preserve">for 10,000 steps or more (about 17 times at 1,000 steps), while still scaling linearly with the number of steps. It still only reaches 15% of the bandwidth limit, because each step has to wait for the one before it, so the real limit is how quickly one step can follow another rather than memory. On this 15-week dataset the loop only takes milliseconds either way, so the speed-up matters most if the model is fitted many times or scaled up to many sensors over several years. The neural network does much more arithmetic per byte (8.2), which puts it in the compute-limited region, but its small layers mean it only reaches 2.9% of peak.</w:t>
       </w:r>
     </w:p>
     <w:p>
@@ -4898,7 +4901,7 @@
         <w:pStyle w:val="Compact"/>
       </w:pPr>
       <w:r>
-        <w:t xml:space="preserve">Its first JSON reader threw away whole messages when one reading had an error, losing 29,043 readings.</w:t>
+        <w:t xml:space="preserve">Its first JSON reader threw away whole messages when one reading had an error, discarding 29,043 messages and the valid CO₂ reading in each.</w:t>
       </w:r>
     </w:p>
     <w:p>

</xml_diff>